<commit_message>
Memo en Arial 11, firma fija, aplicaciones múltiples con nota de diferencia e historial
- Plantilla: Arial 11 en todo el memo salvo DISTRIBUCIÓN; firma fija ELIANA ROJAS SILVA
- Un IPE puede aplicarse a varios documentos; el saldo se descuenta en cada fila
  y, si queda remanente, se agrega "Nota: Diferencia de ..." (formato memo Nº 176)
- Historial de memos generados: los documentos con memo salen de pendientes;
  re-descarga, volver a pendientes, exportar a Excel y respaldo/importación
- Fechas de archivos descargados en hora local

Co-Authored-By: Claude Opus 5.5 <noreply@anthropic.com>
</commit_message>
<xml_diff>
--- a/templates/memo_template.docx
+++ b/templates/memo_template.docx
@@ -20,39 +20,43 @@
           <w:tab w:val="left" w:pos="142"/>
         </w:tabs>
         <w:rPr>
-          <w:b/>
-          <w:bCs/>
-          <w:sz w:val="18"/>
-          <w:szCs w:val="18"/>
+          <w:rFonts w:ascii="Arial" w:hAnsi="Arial" w:eastAsia="Arial" w:cs="Arial"/>
+          <w:b/>
+          <w:bCs/>
+          <w:sz w:val="22"/>
+          <w:szCs w:val="22"/>
           <w:u w:val="none"/>
         </w:rPr>
       </w:pPr>
       <w:r>
         <w:rPr>
-          <w:b/>
-          <w:bCs/>
-          <w:sz w:val="18"/>
-          <w:szCs w:val="18"/>
+          <w:rFonts w:ascii="Arial" w:hAnsi="Arial" w:eastAsia="Arial" w:cs="Arial"/>
+          <w:b/>
+          <w:bCs/>
+          <w:sz w:val="22"/>
+          <w:szCs w:val="22"/>
           <w:u w:val="none"/>
         </w:rPr>
         <w:t xml:space="preserve">          </w:t>
       </w:r>
       <w:r>
         <w:rPr>
-          <w:b/>
-          <w:bCs/>
-          <w:sz w:val="18"/>
-          <w:szCs w:val="18"/>
+          <w:rFonts w:ascii="Arial" w:hAnsi="Arial" w:eastAsia="Arial" w:cs="Arial"/>
+          <w:b/>
+          <w:bCs/>
+          <w:sz w:val="22"/>
+          <w:szCs w:val="22"/>
           <w:u w:val="none"/>
         </w:rPr>
         <w:t xml:space="preserve">          </w:t>
       </w:r>
       <w:r>
         <w:rPr>
-          <w:b/>
-          <w:bCs/>
-          <w:sz w:val="18"/>
-          <w:szCs w:val="18"/>
+          <w:rFonts w:ascii="Arial" w:hAnsi="Arial" w:eastAsia="Arial" w:cs="Arial"/>
+          <w:b/>
+          <w:bCs/>
+          <w:sz w:val="22"/>
+          <w:szCs w:val="22"/>
           <w:u w:val="none"/>
         </w:rPr>
         <w:t>DEPARTAMENTO COMERCIAL</w:t>
@@ -66,35 +70,39 @@
           <w:tab w:val="left" w:pos="142"/>
         </w:tabs>
         <w:rPr>
-          <w:b/>
-          <w:sz w:val="18"/>
-          <w:szCs w:val="18"/>
+          <w:rFonts w:ascii="Arial" w:hAnsi="Arial" w:eastAsia="Arial" w:cs="Arial"/>
+          <w:b/>
+          <w:sz w:val="22"/>
+          <w:szCs w:val="22"/>
           <w:u w:val="none"/>
         </w:rPr>
       </w:pPr>
       <w:r>
         <w:rPr>
-          <w:b/>
-          <w:sz w:val="18"/>
-          <w:szCs w:val="18"/>
+          <w:rFonts w:ascii="Arial" w:hAnsi="Arial" w:eastAsia="Arial" w:cs="Arial"/>
+          <w:b/>
+          <w:sz w:val="22"/>
+          <w:szCs w:val="22"/>
           <w:u w:val="none"/>
         </w:rPr>
         <w:t xml:space="preserve">SUBDEPARTAMENTO </w:t>
       </w:r>
       <w:r>
         <w:rPr>
-          <w:b/>
-          <w:sz w:val="18"/>
-          <w:szCs w:val="18"/>
+          <w:rFonts w:ascii="Arial" w:hAnsi="Arial" w:eastAsia="Arial" w:cs="Arial"/>
+          <w:b/>
+          <w:sz w:val="22"/>
+          <w:szCs w:val="22"/>
           <w:u w:val="none"/>
         </w:rPr>
         <w:t>COSTOS Y GESTIÓ</w:t>
       </w:r>
       <w:r>
         <w:rPr>
-          <w:b/>
-          <w:sz w:val="18"/>
-          <w:szCs w:val="18"/>
+          <w:rFonts w:ascii="Arial" w:hAnsi="Arial" w:eastAsia="Arial" w:cs="Arial"/>
+          <w:b/>
+          <w:sz w:val="22"/>
+          <w:szCs w:val="22"/>
           <w:u w:val="none"/>
         </w:rPr>
         <w:t>N DE INGRESOS</w:t>
@@ -159,16 +167,7 @@
       <w:pPr>
         <w:pStyle w:val="Ttulo2"/>
         <w:rPr>
-          <w:rFonts w:ascii="Times New Roman" w:hAnsi="Times New Roman" w:cs="Times New Roman"/>
-          <w:b w:val="0"/>
-          <w:bCs w:val="0"/>
-        </w:rPr>
-      </w:pPr>
-    </w:p>
-    <w:p>
-      <w:pPr>
-        <w:pStyle w:val="Ttulo2"/>
-        <w:rPr>
+          <w:rFonts w:ascii="Arial" w:hAnsi="Arial" w:eastAsia="Arial" w:cs="Arial"/>
           <w:color w:val="0000FF"/>
           <w:sz w:val="22"/>
           <w:szCs w:val="22"/>
@@ -176,6 +175,7 @@
       </w:pPr>
       <w:r>
         <w:rPr>
+          <w:rFonts w:ascii="Arial" w:hAnsi="Arial" w:eastAsia="Arial" w:cs="Arial"/>
           <w:sz w:val="22"/>
           <w:szCs w:val="22"/>
         </w:rPr>
@@ -183,6 +183,7 @@
       </w:r>
       <w:r>
         <w:rPr>
+          <w:rFonts w:ascii="Arial" w:hAnsi="Arial" w:eastAsia="Arial" w:cs="Arial"/>
           <w:sz w:val="22"/>
           <w:szCs w:val="22"/>
         </w:rPr>
@@ -190,6 +191,7 @@
       </w:r>
       <w:r>
         <w:rPr>
+          <w:rFonts w:ascii="Arial" w:hAnsi="Arial" w:eastAsia="Arial" w:cs="Arial"/>
           <w:sz w:val="22"/>
           <w:szCs w:val="22"/>
         </w:rPr>
@@ -197,6 +199,7 @@
       </w:r>
       <w:r>
         <w:rPr>
+          <w:rFonts w:ascii="Arial" w:hAnsi="Arial" w:eastAsia="Arial" w:cs="Arial"/>
           <w:sz w:val="22"/>
           <w:szCs w:val="22"/>
         </w:rPr>
@@ -204,6 +207,7 @@
       </w:r>
       <w:r>
         <w:rPr>
+          <w:rFonts w:ascii="Arial" w:hAnsi="Arial" w:eastAsia="Arial" w:cs="Arial"/>
           <w:sz w:val="22"/>
           <w:szCs w:val="22"/>
         </w:rPr>
@@ -212,6 +216,7 @@
       <w:proofErr w:type="spellStart"/>
       <w:r>
         <w:rPr>
+          <w:rFonts w:ascii="Arial" w:hAnsi="Arial" w:eastAsia="Arial" w:cs="Arial"/>
           <w:sz w:val="22"/>
           <w:szCs w:val="22"/>
         </w:rPr>
@@ -220,6 +225,7 @@
       <w:proofErr w:type="spellEnd"/>
       <w:r>
         <w:rPr>
+          <w:rFonts w:ascii="Arial" w:hAnsi="Arial" w:eastAsia="Arial" w:cs="Arial"/>
           <w:sz w:val="22"/>
           <w:szCs w:val="22"/>
         </w:rPr>
@@ -227,6 +233,7 @@
       </w:r>
       <w:r>
         <w:rPr>
+          <w:rFonts w:ascii="Arial" w:hAnsi="Arial" w:eastAsia="Arial" w:cs="Arial"/>
           <w:sz w:val="22"/>
           <w:szCs w:val="22"/>
         </w:rPr>
@@ -251,26 +258,18 @@
     </w:p>
     <w:p>
       <w:pPr>
-        <w:rPr>
-          <w:sz w:val="22"/>
-          <w:szCs w:val="22"/>
-        </w:rPr>
-      </w:pPr>
-    </w:p>
-    <w:p>
-      <w:pPr>
         <w:jc w:val="right"/>
         <w:rPr>
-          <w:rFonts w:ascii="Arial" w:hAnsi="Arial" w:cs="Arial"/>
-          <w:b/>
-          <w:bCs/>
-          <w:sz w:val="22"/>
-          <w:szCs w:val="22"/>
-        </w:rPr>
-      </w:pPr>
-      <w:r>
-        <w:rPr>
-          <w:rFonts w:ascii="Arial" w:hAnsi="Arial" w:cs="Arial"/>
+          <w:rFonts w:ascii="Arial" w:hAnsi="Arial" w:eastAsia="Arial" w:cs="Arial"/>
+          <w:b/>
+          <w:bCs/>
+          <w:sz w:val="22"/>
+          <w:szCs w:val="22"/>
+        </w:rPr>
+      </w:pPr>
+      <w:r>
+        <w:rPr>
+          <w:rFonts w:ascii="Arial" w:hAnsi="Arial" w:eastAsia="Arial" w:cs="Arial"/>
           <w:b/>
           <w:bCs/>
           <w:sz w:val="22"/>
@@ -280,7 +279,7 @@
       </w:r>
       <w:r>
         <w:rPr>
-          <w:rFonts w:ascii="Arial" w:hAnsi="Arial" w:cs="Arial"/>
+          <w:rFonts w:ascii="Arial" w:hAnsi="Arial" w:eastAsia="Arial" w:cs="Arial"/>
           <w:b/>
           <w:bCs/>
           <w:sz w:val="22"/>
@@ -290,7 +289,7 @@
       </w:r>
       <w:r>
         <w:rPr>
-          <w:rFonts w:ascii="Arial" w:hAnsi="Arial" w:cs="Arial"/>
+          <w:rFonts w:ascii="Arial" w:hAnsi="Arial" w:eastAsia="Arial" w:cs="Arial"/>
           <w:b/>
           <w:bCs/>
           <w:sz w:val="22"/>
@@ -300,7 +299,7 @@
       </w:r>
       <w:r>
         <w:rPr>
-          <w:rFonts w:ascii="Arial" w:hAnsi="Arial" w:cs="Arial"/>
+          <w:rFonts w:ascii="Arial" w:hAnsi="Arial" w:eastAsia="Arial" w:cs="Arial"/>
           <w:b/>
           <w:bCs/>
           <w:sz w:val="22"/>
@@ -310,7 +309,7 @@
       </w:r>
       <w:r>
         <w:rPr>
-          <w:rFonts w:ascii="Arial" w:hAnsi="Arial" w:cs="Arial"/>
+          <w:rFonts w:ascii="Arial" w:hAnsi="Arial" w:eastAsia="Arial" w:cs="Arial"/>
           <w:b/>
           <w:bCs/>
           <w:sz w:val="22"/>
@@ -320,7 +319,7 @@
       </w:r>
       <w:r>
         <w:rPr>
-          <w:rFonts w:ascii="Arial" w:hAnsi="Arial" w:cs="Arial"/>
+          <w:rFonts w:ascii="Arial" w:hAnsi="Arial" w:eastAsia="Arial" w:cs="Arial"/>
           <w:b/>
           <w:bCs/>
           <w:sz w:val="22"/>
@@ -330,7 +329,7 @@
       </w:r>
       <w:r>
         <w:rPr>
-          <w:rFonts w:ascii="Arial" w:hAnsi="Arial" w:cs="Arial"/>
+          <w:rFonts w:ascii="Arial" w:hAnsi="Arial" w:eastAsia="Arial" w:cs="Arial"/>
           <w:b/>
           <w:bCs/>
           <w:sz w:val="22"/>
@@ -340,7 +339,7 @@
       </w:r>
       <w:r>
         <w:rPr>
-          <w:rFonts w:ascii="Arial" w:hAnsi="Arial" w:cs="Arial"/>
+          <w:rFonts w:ascii="Arial" w:hAnsi="Arial" w:eastAsia="Arial" w:cs="Arial"/>
           <w:b/>
           <w:bCs/>
           <w:sz w:val="22"/>
@@ -372,12 +371,14 @@
           <w:tab w:val="left" w:pos="1843"/>
         </w:tabs>
         <w:rPr>
-          <w:sz w:val="22"/>
-          <w:szCs w:val="22"/>
-        </w:rPr>
-      </w:pPr>
-      <w:r>
-        <w:rPr>
+          <w:rFonts w:ascii="Arial" w:hAnsi="Arial" w:eastAsia="Arial" w:cs="Arial"/>
+          <w:sz w:val="22"/>
+          <w:szCs w:val="22"/>
+        </w:rPr>
+      </w:pPr>
+      <w:r>
+        <w:rPr>
+          <w:rFonts w:ascii="Arial" w:hAnsi="Arial" w:eastAsia="Arial" w:cs="Arial"/>
           <w:sz w:val="22"/>
           <w:szCs w:val="22"/>
         </w:rPr>
@@ -385,6 +386,7 @@
       </w:r>
       <w:r>
         <w:rPr>
+          <w:rFonts w:ascii="Arial" w:hAnsi="Arial" w:eastAsia="Arial" w:cs="Arial"/>
           <w:sz w:val="22"/>
           <w:szCs w:val="22"/>
         </w:rPr>
@@ -393,6 +395,7 @@
       </w:r>
       <w:r>
         <w:rPr>
+          <w:rFonts w:ascii="Arial" w:hAnsi="Arial" w:eastAsia="Arial" w:cs="Arial"/>
           <w:sz w:val="22"/>
           <w:szCs w:val="22"/>
         </w:rPr>
@@ -401,6 +404,7 @@
       </w:r>
       <w:r>
         <w:rPr>
+          <w:rFonts w:ascii="Arial" w:hAnsi="Arial" w:eastAsia="Arial" w:cs="Arial"/>
           <w:sz w:val="22"/>
           <w:szCs w:val="22"/>
         </w:rPr>
@@ -438,16 +442,16 @@
         </w:tabs>
         <w:jc w:val="both"/>
         <w:rPr>
-          <w:rFonts w:ascii="Arial" w:hAnsi="Arial" w:cs="Arial"/>
-          <w:b/>
-          <w:bCs/>
-          <w:sz w:val="22"/>
-          <w:szCs w:val="22"/>
-        </w:rPr>
-      </w:pPr>
-      <w:r>
-        <w:rPr>
-          <w:rFonts w:ascii="Arial" w:hAnsi="Arial" w:cs="Arial"/>
+          <w:rFonts w:ascii="Arial" w:hAnsi="Arial" w:eastAsia="Arial" w:cs="Arial"/>
+          <w:b/>
+          <w:bCs/>
+          <w:sz w:val="22"/>
+          <w:szCs w:val="22"/>
+        </w:rPr>
+      </w:pPr>
+      <w:r>
+        <w:rPr>
+          <w:rFonts w:ascii="Arial" w:hAnsi="Arial" w:eastAsia="Arial" w:cs="Arial"/>
           <w:b/>
           <w:bCs/>
           <w:sz w:val="22"/>
@@ -457,7 +461,7 @@
       </w:r>
       <w:r>
         <w:rPr>
-          <w:rFonts w:ascii="Arial" w:hAnsi="Arial" w:cs="Arial"/>
+          <w:rFonts w:ascii="Arial" w:hAnsi="Arial" w:eastAsia="Arial" w:cs="Arial"/>
           <w:b/>
           <w:bCs/>
           <w:sz w:val="22"/>
@@ -468,7 +472,7 @@
       </w:r>
       <w:r>
         <w:rPr>
-          <w:rFonts w:ascii="Arial" w:hAnsi="Arial" w:cs="Arial"/>
+          <w:rFonts w:ascii="Arial" w:hAnsi="Arial" w:eastAsia="Arial" w:cs="Arial"/>
           <w:b/>
           <w:bCs/>
           <w:sz w:val="22"/>
@@ -478,7 +482,7 @@
       </w:r>
       <w:r>
         <w:rPr>
-          <w:rFonts w:ascii="Arial" w:hAnsi="Arial" w:cs="Arial"/>
+          <w:rFonts w:ascii="Arial" w:hAnsi="Arial" w:eastAsia="Arial" w:cs="Arial"/>
           <w:b/>
           <w:bCs/>
           <w:sz w:val="22"/>
@@ -520,15 +524,15 @@
         <w:ind w:left="1985" w:hanging="1985"/>
         <w:jc w:val="both"/>
         <w:rPr>
-          <w:rFonts w:ascii="Arial" w:hAnsi="Arial" w:cs="Arial"/>
-          <w:bCs/>
-          <w:sz w:val="22"/>
-          <w:szCs w:val="22"/>
-        </w:rPr>
-      </w:pPr>
-      <w:r>
-        <w:rPr>
-          <w:rFonts w:ascii="Arial" w:hAnsi="Arial" w:cs="Arial"/>
+          <w:rFonts w:ascii="Arial" w:hAnsi="Arial" w:eastAsia="Arial" w:cs="Arial"/>
+          <w:bCs/>
+          <w:sz w:val="22"/>
+          <w:szCs w:val="22"/>
+        </w:rPr>
+      </w:pPr>
+      <w:r>
+        <w:rPr>
+          <w:rFonts w:ascii="Arial" w:hAnsi="Arial" w:eastAsia="Arial" w:cs="Arial"/>
           <w:bCs/>
           <w:sz w:val="22"/>
           <w:szCs w:val="22"/>
@@ -537,7 +541,7 @@
       </w:r>
       <w:r>
         <w:rPr>
-          <w:rFonts w:ascii="Arial" w:hAnsi="Arial" w:cs="Arial"/>
+          <w:rFonts w:ascii="Arial" w:hAnsi="Arial" w:eastAsia="Arial" w:cs="Arial"/>
           <w:bCs/>
           <w:sz w:val="22"/>
           <w:szCs w:val="22"/>
@@ -547,7 +551,7 @@
       </w:r>
       <w:r>
         <w:rPr>
-          <w:rFonts w:ascii="Arial" w:hAnsi="Arial" w:cs="Arial"/>
+          <w:rFonts w:ascii="Arial" w:hAnsi="Arial" w:eastAsia="Arial" w:cs="Arial"/>
           <w:bCs/>
           <w:sz w:val="22"/>
           <w:szCs w:val="22"/>
@@ -556,7 +560,7 @@
       </w:r>
       <w:r>
         <w:rPr>
-          <w:rFonts w:ascii="Arial" w:hAnsi="Arial" w:cs="Arial"/>
+          <w:rFonts w:ascii="Arial" w:hAnsi="Arial" w:eastAsia="Arial" w:cs="Arial"/>
           <w:b/>
           <w:bCs/>
           <w:sz w:val="22"/>
@@ -566,7 +570,7 @@
       </w:r>
       <w:r>
         <w:rPr>
-          <w:rFonts w:ascii="Arial" w:hAnsi="Arial" w:cs="Arial"/>
+          <w:rFonts w:ascii="Arial" w:hAnsi="Arial" w:eastAsia="Arial" w:cs="Arial"/>
           <w:bCs/>
           <w:sz w:val="22"/>
           <w:szCs w:val="22"/>
@@ -575,7 +579,7 @@
       </w:r>
       <w:r>
         <w:rPr>
-          <w:rFonts w:ascii="Arial" w:hAnsi="Arial" w:cs="Arial"/>
+          <w:rFonts w:ascii="Arial" w:hAnsi="Arial" w:eastAsia="Arial" w:cs="Arial"/>
           <w:bCs/>
           <w:sz w:val="22"/>
           <w:szCs w:val="22"/>
@@ -584,7 +588,7 @@
       </w:r>
       <w:r>
         <w:rPr>
-          <w:rFonts w:ascii="Arial" w:hAnsi="Arial" w:cs="Arial"/>
+          <w:rFonts w:ascii="Arial" w:hAnsi="Arial" w:eastAsia="Arial" w:cs="Arial"/>
           <w:bCs/>
           <w:sz w:val="22"/>
           <w:szCs w:val="22"/>
@@ -593,7 +597,7 @@
       </w:r>
       <w:r>
         <w:rPr>
-          <w:rFonts w:ascii="Arial" w:hAnsi="Arial" w:cs="Arial"/>
+          <w:rFonts w:ascii="Arial" w:hAnsi="Arial" w:eastAsia="Arial" w:cs="Arial"/>
           <w:bCs/>
           <w:sz w:val="22"/>
           <w:szCs w:val="22"/>
@@ -602,7 +606,7 @@
       </w:r>
       <w:r>
         <w:rPr>
-          <w:rFonts w:ascii="Arial" w:hAnsi="Arial" w:cs="Arial"/>
+          <w:rFonts w:ascii="Arial" w:hAnsi="Arial" w:eastAsia="Arial" w:cs="Arial"/>
           <w:bCs/>
           <w:sz w:val="22"/>
           <w:szCs w:val="22"/>
@@ -611,7 +615,7 @@
       </w:r>
       <w:r>
         <w:rPr>
-          <w:rFonts w:ascii="Arial" w:hAnsi="Arial" w:cs="Arial"/>
+          <w:rFonts w:ascii="Arial" w:hAnsi="Arial" w:eastAsia="Arial" w:cs="Arial"/>
           <w:bCs/>
           <w:sz w:val="22"/>
           <w:szCs w:val="22"/>
@@ -620,7 +624,7 @@
       </w:r>
       <w:r>
         <w:rPr>
-          <w:rFonts w:ascii="Arial" w:hAnsi="Arial" w:cs="Arial"/>
+          <w:rFonts w:ascii="Arial" w:hAnsi="Arial" w:eastAsia="Arial" w:cs="Arial"/>
           <w:bCs/>
           <w:sz w:val="22"/>
           <w:szCs w:val="22"/>
@@ -629,7 +633,7 @@
       </w:r>
       <w:r>
         <w:rPr>
-          <w:rFonts w:ascii="Arial" w:hAnsi="Arial" w:cs="Arial"/>
+          <w:rFonts w:ascii="Arial" w:hAnsi="Arial" w:eastAsia="Arial" w:cs="Arial"/>
           <w:bCs/>
           <w:sz w:val="22"/>
           <w:szCs w:val="22"/>
@@ -638,7 +642,7 @@
       </w:r>
       <w:r>
         <w:rPr>
-          <w:rFonts w:ascii="Arial" w:hAnsi="Arial" w:cs="Arial"/>
+          <w:rFonts w:ascii="Arial" w:hAnsi="Arial" w:eastAsia="Arial" w:cs="Arial"/>
           <w:bCs/>
           <w:sz w:val="22"/>
           <w:szCs w:val="22"/>
@@ -647,7 +651,7 @@
       </w:r>
       <w:r>
         <w:rPr>
-          <w:rFonts w:ascii="Arial" w:hAnsi="Arial" w:cs="Arial"/>
+          <w:rFonts w:ascii="Arial" w:hAnsi="Arial" w:eastAsia="Arial" w:cs="Arial"/>
           <w:bCs/>
           <w:sz w:val="22"/>
           <w:szCs w:val="22"/>
@@ -656,7 +660,7 @@
       </w:r>
       <w:r>
         <w:rPr>
-          <w:rFonts w:ascii="Arial" w:hAnsi="Arial" w:cs="Arial"/>
+          <w:rFonts w:ascii="Arial" w:hAnsi="Arial" w:eastAsia="Arial" w:cs="Arial"/>
           <w:bCs/>
           <w:sz w:val="22"/>
           <w:szCs w:val="22"/>
@@ -665,7 +669,7 @@
       </w:r>
       <w:r>
         <w:rPr>
-          <w:rFonts w:ascii="Arial" w:hAnsi="Arial" w:cs="Arial"/>
+          <w:rFonts w:ascii="Arial" w:hAnsi="Arial" w:eastAsia="Arial" w:cs="Arial"/>
           <w:bCs/>
           <w:sz w:val="22"/>
           <w:szCs w:val="22"/>
@@ -697,14 +701,14 @@
         <w:ind w:left="2127" w:hanging="2127"/>
         <w:jc w:val="left"/>
         <w:rPr>
-          <w:rFonts w:ascii="Arial" w:hAnsi="Arial" w:cs="Arial"/>
-          <w:sz w:val="22"/>
-          <w:szCs w:val="22"/>
-        </w:rPr>
-      </w:pPr>
-      <w:r>
-        <w:rPr>
-          <w:rFonts w:ascii="Arial" w:hAnsi="Arial" w:cs="Arial"/>
+          <w:rFonts w:ascii="Arial" w:hAnsi="Arial" w:eastAsia="Arial" w:cs="Arial"/>
+          <w:sz w:val="22"/>
+          <w:szCs w:val="22"/>
+        </w:rPr>
+      </w:pPr>
+      <w:r>
+        <w:rPr>
+          <w:rFonts w:ascii="Arial" w:hAnsi="Arial" w:eastAsia="Arial" w:cs="Arial"/>
           <w:bCs/>
           <w:sz w:val="22"/>
           <w:szCs w:val="22"/>
@@ -713,7 +717,7 @@
       </w:r>
       <w:r>
         <w:rPr>
-          <w:rFonts w:ascii="Arial" w:hAnsi="Arial" w:cs="Arial"/>
+          <w:rFonts w:ascii="Arial" w:hAnsi="Arial" w:eastAsia="Arial" w:cs="Arial"/>
           <w:bCs/>
           <w:sz w:val="22"/>
           <w:szCs w:val="22"/>
@@ -723,7 +727,7 @@
       </w:r>
       <w:r>
         <w:rPr>
-          <w:rFonts w:ascii="Arial" w:hAnsi="Arial" w:cs="Arial"/>
+          <w:rFonts w:ascii="Arial" w:hAnsi="Arial" w:eastAsia="Arial" w:cs="Arial"/>
           <w:bCs/>
           <w:sz w:val="22"/>
           <w:szCs w:val="22"/>
@@ -732,7 +736,7 @@
       </w:r>
       <w:r>
         <w:rPr>
-          <w:rFonts w:ascii="Arial" w:hAnsi="Arial" w:cs="Arial"/>
+          <w:rFonts w:ascii="Arial" w:hAnsi="Arial" w:eastAsia="Arial" w:cs="Arial"/>
           <w:b/>
           <w:bCs/>
           <w:sz w:val="22"/>
@@ -742,7 +746,7 @@
       </w:r>
       <w:r>
         <w:rPr>
-          <w:rFonts w:ascii="Arial" w:hAnsi="Arial" w:cs="Arial"/>
+          <w:rFonts w:ascii="Arial" w:hAnsi="Arial" w:eastAsia="Arial" w:cs="Arial"/>
           <w:b/>
           <w:bCs/>
           <w:sz w:val="22"/>
@@ -752,7 +756,7 @@
       </w:r>
       <w:r>
         <w:rPr>
-          <w:rFonts w:ascii="Arial" w:hAnsi="Arial" w:cs="Arial"/>
+          <w:rFonts w:ascii="Arial" w:hAnsi="Arial" w:eastAsia="Arial" w:cs="Arial"/>
           <w:b/>
           <w:bCs/>
           <w:sz w:val="22"/>
@@ -762,7 +766,7 @@
       </w:r>
       <w:r>
         <w:rPr>
-          <w:rFonts w:ascii="Arial" w:hAnsi="Arial" w:cs="Arial"/>
+          <w:rFonts w:ascii="Arial" w:hAnsi="Arial" w:eastAsia="Arial" w:cs="Arial"/>
           <w:b/>
           <w:bCs/>
           <w:sz w:val="22"/>
@@ -772,7 +776,7 @@
       </w:r>
       <w:r>
         <w:rPr>
-          <w:rFonts w:ascii="Arial" w:hAnsi="Arial" w:cs="Arial"/>
+          <w:rFonts w:ascii="Arial" w:hAnsi="Arial" w:eastAsia="Arial" w:cs="Arial"/>
           <w:sz w:val="22"/>
           <w:szCs w:val="22"/>
         </w:rPr>
@@ -811,63 +815,17 @@
     </w:p>
     <w:p>
       <w:pPr>
-        <w:tabs>
-          <w:tab w:val="left" w:pos="1843"/>
-          <w:tab w:val="left" w:pos="1985"/>
-        </w:tabs>
-        <w:ind w:left="2127" w:hanging="2127"/>
         <w:jc w:val="both"/>
         <w:rPr>
-          <w:rFonts w:ascii="Arial" w:hAnsi="Arial" w:cs="Arial"/>
-          <w:bCs/>
-          <w:sz w:val="22"/>
-          <w:szCs w:val="22"/>
-        </w:rPr>
-      </w:pPr>
-      <w:r>
-        <w:rPr>
-          <w:rFonts w:ascii="Arial" w:hAnsi="Arial" w:cs="Arial"/>
-          <w:b/>
-          <w:bCs/>
-          <w:sz w:val="22"/>
-          <w:szCs w:val="22"/>
-        </w:rPr>
-        <w:t xml:space="preserve">                                   </w:t>
-      </w:r>
-      <w:r>
-        <w:rPr>
-          <w:rFonts w:ascii="Arial" w:hAnsi="Arial" w:cs="Arial"/>
-          <w:b/>
-          <w:bCs/>
-          <w:sz w:val="22"/>
-          <w:szCs w:val="22"/>
-        </w:rPr>
-        <w:t xml:space="preserve">                        </w:t>
-      </w:r>
-      <w:r>
-        <w:rPr>
-          <w:rFonts w:ascii="Arial" w:hAnsi="Arial" w:cs="Arial"/>
-          <w:b/>
-          <w:bCs/>
-          <w:sz w:val="22"/>
-          <w:szCs w:val="22"/>
-        </w:rPr>
-        <w:t xml:space="preserve">                               </w:t>
-      </w:r>
-    </w:p>
-    <w:p>
-      <w:pPr>
-        <w:jc w:val="both"/>
-        <w:rPr>
-          <w:rFonts w:ascii="Calibri" w:hAnsi="Calibri" w:cs="Calibri"/>
-          <w:sz w:val="20"/>
-          <w:szCs w:val="20"/>
+          <w:rFonts w:ascii="Arial" w:hAnsi="Arial" w:eastAsia="Arial" w:cs="Arial"/>
+          <w:sz w:val="22"/>
+          <w:szCs w:val="22"/>
           <w:lang w:val="es-CL" w:eastAsia="es-CL"/>
         </w:rPr>
       </w:pPr>
       <w:r>
         <w:rPr>
-          <w:rFonts w:cs="Arial"/>
+          <w:rFonts w:ascii="Arial" w:hAnsi="Arial" w:eastAsia="Arial" w:cs="Arial"/>
           <w:sz w:val="22"/>
           <w:szCs w:val="22"/>
         </w:rPr>
@@ -875,7 +833,7 @@
       </w:r>
       <w:r>
         <w:rPr>
-          <w:rFonts w:cs="Arial"/>
+          <w:rFonts w:ascii="Arial" w:hAnsi="Arial" w:eastAsia="Arial" w:cs="Arial"/>
           <w:sz w:val="22"/>
           <w:szCs w:val="22"/>
         </w:rPr>
@@ -883,7 +841,7 @@
       </w:r>
       <w:r>
         <w:rPr>
-          <w:rFonts w:cs="Arial"/>
+          <w:rFonts w:ascii="Arial" w:hAnsi="Arial" w:eastAsia="Arial" w:cs="Arial"/>
           <w:sz w:val="22"/>
           <w:szCs w:val="22"/>
         </w:rPr>
@@ -891,7 +849,7 @@
       </w:r>
       <w:r>
         <w:rPr>
-          <w:rFonts w:cs="Arial"/>
+          <w:rFonts w:ascii="Arial" w:hAnsi="Arial" w:eastAsia="Arial" w:cs="Arial"/>
           <w:sz w:val="22"/>
           <w:szCs w:val="22"/>
         </w:rPr>
@@ -899,7 +857,7 @@
       </w:r>
       <w:r>
         <w:rPr>
-          <w:rFonts w:cs="Arial"/>
+          <w:rFonts w:ascii="Arial" w:hAnsi="Arial" w:eastAsia="Arial" w:cs="Arial"/>
           <w:sz w:val="22"/>
           <w:szCs w:val="22"/>
         </w:rPr>
@@ -907,7 +865,7 @@
       </w:r>
       <w:r>
         <w:rPr>
-          <w:rFonts w:cs="Arial"/>
+          <w:rFonts w:ascii="Arial" w:hAnsi="Arial" w:eastAsia="Arial" w:cs="Arial"/>
           <w:sz w:val="22"/>
           <w:szCs w:val="22"/>
           <w:lang w:val="es-CL"/>
@@ -916,9 +874,9 @@
       </w:r>
       <w:r>
         <w:rPr>
-          <w:rFonts w:ascii="Calibri" w:hAnsi="Calibri" w:cs="Calibri"/>
-          <w:sz w:val="20"/>
-          <w:szCs w:val="20"/>
+          <w:rFonts w:ascii="Arial" w:hAnsi="Arial" w:eastAsia="Arial" w:cs="Arial"/>
+          <w:sz w:val="22"/>
+          <w:szCs w:val="22"/>
         </w:rPr>
         <w:t xml:space="preserve">{rut}</w:t>
       </w:r>
@@ -997,21 +955,21 @@
             <w:pPr>
               <w:jc w:val="center"/>
               <w:rPr>
-                <w:rFonts w:ascii="Arial" w:hAnsi="Arial" w:cs="Arial"/>
+                <w:rFonts w:ascii="Arial" w:hAnsi="Arial" w:eastAsia="Arial" w:cs="Arial"/>
                 <w:b/>
                 <w:bCs/>
-                <w:sz w:val="20"/>
-                <w:szCs w:val="20"/>
+                <w:sz w:val="22"/>
+                <w:szCs w:val="22"/>
                 <w:lang w:val="es-CL" w:eastAsia="es-CL"/>
               </w:rPr>
             </w:pPr>
             <w:r>
               <w:rPr>
-                <w:rFonts w:ascii="Arial" w:hAnsi="Arial" w:cs="Arial"/>
+                <w:rFonts w:ascii="Arial" w:hAnsi="Arial" w:eastAsia="Arial" w:cs="Arial"/>
                 <w:b/>
                 <w:bCs/>
-                <w:sz w:val="20"/>
-                <w:szCs w:val="20"/>
+                <w:sz w:val="22"/>
+                <w:szCs w:val="22"/>
               </w:rPr>
               <w:t>Tipo de Documento</w:t>
             </w:r>
@@ -1033,20 +991,20 @@
             <w:pPr>
               <w:jc w:val="center"/>
               <w:rPr>
-                <w:rFonts w:ascii="Arial" w:hAnsi="Arial" w:cs="Arial"/>
+                <w:rFonts w:ascii="Arial" w:hAnsi="Arial" w:eastAsia="Arial" w:cs="Arial"/>
                 <w:b/>
                 <w:bCs/>
-                <w:sz w:val="20"/>
-                <w:szCs w:val="20"/>
+                <w:sz w:val="22"/>
+                <w:szCs w:val="22"/>
               </w:rPr>
             </w:pPr>
             <w:r>
               <w:rPr>
-                <w:rFonts w:ascii="Arial" w:hAnsi="Arial" w:cs="Arial"/>
+                <w:rFonts w:ascii="Arial" w:hAnsi="Arial" w:eastAsia="Arial" w:cs="Arial"/>
                 <w:b/>
                 <w:bCs/>
-                <w:sz w:val="20"/>
-                <w:szCs w:val="20"/>
+                <w:sz w:val="22"/>
+                <w:szCs w:val="22"/>
               </w:rPr>
               <w:t>Nº Docto I.A.</w:t>
             </w:r>
@@ -1068,20 +1026,20 @@
             <w:pPr>
               <w:jc w:val="center"/>
               <w:rPr>
-                <w:rFonts w:ascii="Arial" w:hAnsi="Arial" w:cs="Arial"/>
+                <w:rFonts w:ascii="Arial" w:hAnsi="Arial" w:eastAsia="Arial" w:cs="Arial"/>
                 <w:b/>
                 <w:bCs/>
-                <w:sz w:val="20"/>
-                <w:szCs w:val="20"/>
+                <w:sz w:val="22"/>
+                <w:szCs w:val="22"/>
               </w:rPr>
             </w:pPr>
             <w:r>
               <w:rPr>
-                <w:rFonts w:ascii="Arial" w:hAnsi="Arial" w:cs="Arial"/>
+                <w:rFonts w:ascii="Arial" w:hAnsi="Arial" w:eastAsia="Arial" w:cs="Arial"/>
                 <w:b/>
                 <w:bCs/>
-                <w:sz w:val="20"/>
-                <w:szCs w:val="20"/>
+                <w:sz w:val="22"/>
+                <w:szCs w:val="22"/>
               </w:rPr>
               <w:t>Monto</w:t>
             </w:r>
@@ -1103,20 +1061,20 @@
             <w:pPr>
               <w:jc w:val="center"/>
               <w:rPr>
-                <w:rFonts w:ascii="Arial" w:hAnsi="Arial" w:cs="Arial"/>
+                <w:rFonts w:ascii="Arial" w:hAnsi="Arial" w:eastAsia="Arial" w:cs="Arial"/>
                 <w:b/>
                 <w:bCs/>
-                <w:sz w:val="20"/>
-                <w:szCs w:val="20"/>
+                <w:sz w:val="22"/>
+                <w:szCs w:val="22"/>
               </w:rPr>
             </w:pPr>
             <w:r>
               <w:rPr>
-                <w:rFonts w:ascii="Arial" w:hAnsi="Arial" w:cs="Arial"/>
+                <w:rFonts w:ascii="Arial" w:hAnsi="Arial" w:eastAsia="Arial" w:cs="Arial"/>
                 <w:b/>
                 <w:bCs/>
-                <w:sz w:val="20"/>
-                <w:szCs w:val="20"/>
+                <w:sz w:val="22"/>
+                <w:szCs w:val="22"/>
               </w:rPr>
               <w:t>Docto a Aplicar</w:t>
             </w:r>
@@ -1138,20 +1096,20 @@
             <w:pPr>
               <w:jc w:val="center"/>
               <w:rPr>
-                <w:rFonts w:ascii="Arial" w:hAnsi="Arial" w:cs="Arial"/>
+                <w:rFonts w:ascii="Arial" w:hAnsi="Arial" w:eastAsia="Arial" w:cs="Arial"/>
                 <w:b/>
                 <w:bCs/>
-                <w:sz w:val="20"/>
-                <w:szCs w:val="20"/>
+                <w:sz w:val="22"/>
+                <w:szCs w:val="22"/>
               </w:rPr>
             </w:pPr>
             <w:r>
               <w:rPr>
-                <w:rFonts w:ascii="Arial" w:hAnsi="Arial" w:cs="Arial"/>
+                <w:rFonts w:ascii="Arial" w:hAnsi="Arial" w:eastAsia="Arial" w:cs="Arial"/>
                 <w:b/>
                 <w:bCs/>
-                <w:sz w:val="20"/>
-                <w:szCs w:val="20"/>
+                <w:sz w:val="22"/>
+                <w:szCs w:val="22"/>
               </w:rPr>
               <w:t>Monto a Aplicar</w:t>
             </w:r>
@@ -1178,16 +1136,16 @@
             <w:pPr>
               <w:jc w:val="center"/>
               <w:rPr>
-                <w:rFonts w:ascii="Arial" w:hAnsi="Arial" w:cs="Arial"/>
-                <w:sz w:val="20"/>
-                <w:szCs w:val="20"/>
+                <w:rFonts w:ascii="Arial" w:hAnsi="Arial" w:eastAsia="Arial" w:cs="Arial"/>
+                <w:sz w:val="22"/>
+                <w:szCs w:val="22"/>
               </w:rPr>
             </w:pPr>
             <w:r>
               <w:rPr>
-                <w:rFonts w:ascii="Arial" w:hAnsi="Arial" w:cs="Arial"/>
-                <w:sz w:val="20"/>
-                <w:szCs w:val="20"/>
+                <w:rFonts w:ascii="Arial" w:hAnsi="Arial" w:eastAsia="Arial" w:cs="Arial"/>
+                <w:sz w:val="22"/>
+                <w:szCs w:val="22"/>
               </w:rPr>
               <w:t xml:space="preserve">{#items}{doc}</w:t>
             </w:r>
@@ -1209,14 +1167,14 @@
             <w:pPr>
               <w:jc w:val="center"/>
               <w:rPr>
-                <w:rFonts w:ascii="Arial" w:hAnsi="Arial" w:cs="Arial"/>
-                <w:sz w:val="20"/>
-                <w:szCs w:val="20"/>
+                <w:rFonts w:ascii="Arial" w:hAnsi="Arial" w:eastAsia="Arial" w:cs="Arial"/>
+                <w:sz w:val="22"/>
+                <w:szCs w:val="22"/>
               </w:rPr>
             </w:pPr>
             <w:r>
               <w:rPr>
-                <w:rFonts w:ascii="Arial" w:hAnsi="Arial" w:cs="Arial"/>
+                <w:rFonts w:ascii="Arial" w:hAnsi="Arial" w:eastAsia="Arial" w:cs="Arial"/>
                 <w:sz w:val="22"/>
                 <w:szCs w:val="22"/>
               </w:rPr>
@@ -1240,40 +1198,40 @@
             <w:pPr>
               <w:jc w:val="center"/>
               <w:rPr>
-                <w:rFonts w:ascii="Arial" w:hAnsi="Arial" w:cs="Arial"/>
-                <w:sz w:val="20"/>
-                <w:szCs w:val="20"/>
+                <w:rFonts w:ascii="Arial" w:hAnsi="Arial" w:eastAsia="Arial" w:cs="Arial"/>
+                <w:sz w:val="22"/>
+                <w:szCs w:val="22"/>
               </w:rPr>
             </w:pPr>
             <w:r>
               <w:rPr>
-                <w:rFonts w:ascii="Arial" w:hAnsi="Arial" w:cs="Arial"/>
-                <w:sz w:val="20"/>
-                <w:szCs w:val="20"/>
+                <w:rFonts w:ascii="Arial" w:hAnsi="Arial" w:eastAsia="Arial" w:cs="Arial"/>
+                <w:sz w:val="22"/>
+                <w:szCs w:val="22"/>
               </w:rPr>
               <w:t xml:space="preserve">{monto}</w:t>
             </w:r>
             <w:r>
               <w:rPr>
-                <w:rFonts w:ascii="Arial" w:hAnsi="Arial" w:cs="Arial"/>
-                <w:sz w:val="20"/>
-                <w:szCs w:val="20"/>
+                <w:rFonts w:ascii="Arial" w:hAnsi="Arial" w:eastAsia="Arial" w:cs="Arial"/>
+                <w:sz w:val="22"/>
+                <w:szCs w:val="22"/>
               </w:rPr>
               <w:t/>
             </w:r>
             <w:r>
               <w:rPr>
-                <w:rFonts w:ascii="Arial" w:hAnsi="Arial" w:cs="Arial"/>
-                <w:sz w:val="20"/>
-                <w:szCs w:val="20"/>
+                <w:rFonts w:ascii="Arial" w:hAnsi="Arial" w:eastAsia="Arial" w:cs="Arial"/>
+                <w:sz w:val="22"/>
+                <w:szCs w:val="22"/>
               </w:rPr>
               <w:t/>
             </w:r>
             <w:r>
               <w:rPr>
-                <w:rFonts w:ascii="Arial" w:hAnsi="Arial" w:cs="Arial"/>
-                <w:sz w:val="20"/>
-                <w:szCs w:val="20"/>
+                <w:rFonts w:ascii="Arial" w:hAnsi="Arial" w:eastAsia="Arial" w:cs="Arial"/>
+                <w:sz w:val="22"/>
+                <w:szCs w:val="22"/>
               </w:rPr>
               <w:t/>
             </w:r>
@@ -1295,24 +1253,24 @@
             <w:pPr>
               <w:jc w:val="center"/>
               <w:rPr>
-                <w:rFonts w:ascii="Arial" w:hAnsi="Arial" w:cs="Arial"/>
-                <w:sz w:val="20"/>
-                <w:szCs w:val="20"/>
+                <w:rFonts w:ascii="Arial" w:hAnsi="Arial" w:eastAsia="Arial" w:cs="Arial"/>
+                <w:sz w:val="22"/>
+                <w:szCs w:val="22"/>
               </w:rPr>
             </w:pPr>
             <w:r>
               <w:rPr>
-                <w:rFonts w:ascii="Arial" w:hAnsi="Arial" w:cs="Arial"/>
-                <w:sz w:val="20"/>
-                <w:szCs w:val="20"/>
+                <w:rFonts w:ascii="Arial" w:hAnsi="Arial" w:eastAsia="Arial" w:cs="Arial"/>
+                <w:sz w:val="22"/>
+                <w:szCs w:val="22"/>
               </w:rPr>
               <w:t xml:space="preserve">{docto_aplicar}</w:t>
             </w:r>
             <w:r>
               <w:rPr>
-                <w:rFonts w:ascii="Arial" w:hAnsi="Arial" w:cs="Arial"/>
-                <w:sz w:val="20"/>
-                <w:szCs w:val="20"/>
+                <w:rFonts w:ascii="Arial" w:hAnsi="Arial" w:eastAsia="Arial" w:cs="Arial"/>
+                <w:sz w:val="22"/>
+                <w:szCs w:val="22"/>
               </w:rPr>
               <w:t/>
             </w:r>
@@ -1334,16 +1292,16 @@
             <w:pPr>
               <w:jc w:val="center"/>
               <w:rPr>
-                <w:rFonts w:ascii="Arial" w:hAnsi="Arial" w:cs="Arial"/>
-                <w:sz w:val="20"/>
-                <w:szCs w:val="20"/>
+                <w:rFonts w:ascii="Arial" w:hAnsi="Arial" w:eastAsia="Arial" w:cs="Arial"/>
+                <w:sz w:val="22"/>
+                <w:szCs w:val="22"/>
               </w:rPr>
             </w:pPr>
             <w:r>
               <w:rPr>
-                <w:rFonts w:ascii="Arial" w:hAnsi="Arial" w:cs="Arial"/>
-                <w:sz w:val="20"/>
-                <w:szCs w:val="20"/>
+                <w:rFonts w:ascii="Arial" w:hAnsi="Arial" w:eastAsia="Arial" w:cs="Arial"/>
+                <w:sz w:val="22"/>
+                <w:szCs w:val="22"/>
               </w:rPr>
               <w:t xml:space="preserve">{monto_aplicar}{/items}</w:t>
             </w:r>
@@ -1370,6 +1328,48 @@
     </w:p>
     <w:p>
       <w:pPr>
+        <w:spacing w:after="120"/>
+        <w:jc w:val="both"/>
+      </w:pPr>
+      <w:r>
+        <w:rPr>
+          <w:rFonts w:ascii="Arial" w:hAnsi="Arial" w:eastAsia="Arial" w:cs="Arial"/>
+          <w:sz w:val="22"/>
+          <w:szCs w:val="22"/>
+        </w:rPr>
+        <w:t xml:space="preserve">{#notas}</w:t>
+      </w:r>
+    </w:p>
+    <w:p>
+      <w:pPr>
+        <w:spacing w:after="120"/>
+        <w:jc w:val="both"/>
+      </w:pPr>
+      <w:r>
+        <w:rPr>
+          <w:rFonts w:ascii="Arial" w:hAnsi="Arial" w:eastAsia="Arial" w:cs="Arial"/>
+          <w:sz w:val="22"/>
+          <w:szCs w:val="22"/>
+        </w:rPr>
+        <w:t xml:space="preserve">Nota: Diferencia de {doc} {nro} por {remanente}.- mantener en la cuenta “acreedores por ingresos percibidos en exceso” para su posterior aplicación o devolución al cliente.</w:t>
+      </w:r>
+    </w:p>
+    <w:p>
+      <w:pPr>
+        <w:spacing w:after="120"/>
+        <w:jc w:val="both"/>
+      </w:pPr>
+      <w:r>
+        <w:rPr>
+          <w:rFonts w:ascii="Arial" w:hAnsi="Arial" w:eastAsia="Arial" w:cs="Arial"/>
+          <w:sz w:val="22"/>
+          <w:szCs w:val="22"/>
+        </w:rPr>
+        <w:t xml:space="preserve">{/notas}</w:t>
+      </w:r>
+    </w:p>
+    <w:p>
+      <w:pPr>
         <w:pStyle w:val="Sangra3detindependiente"/>
         <w:ind w:firstLine="0"/>
         <w:jc w:val="both"/>
@@ -1388,14 +1388,14 @@
           <w:tab w:val="left" w:pos="3544"/>
         </w:tabs>
         <w:rPr>
-          <w:rFonts w:ascii="Arial" w:hAnsi="Arial" w:cs="Arial"/>
-          <w:sz w:val="22"/>
-          <w:szCs w:val="22"/>
-        </w:rPr>
-      </w:pPr>
-      <w:r>
-        <w:rPr>
-          <w:rFonts w:ascii="Arial" w:hAnsi="Arial" w:cs="Arial"/>
+          <w:rFonts w:ascii="Arial" w:hAnsi="Arial" w:eastAsia="Arial" w:cs="Arial"/>
+          <w:sz w:val="22"/>
+          <w:szCs w:val="22"/>
+        </w:rPr>
+      </w:pPr>
+      <w:r>
+        <w:rPr>
+          <w:rFonts w:ascii="Arial" w:hAnsi="Arial" w:eastAsia="Arial" w:cs="Arial"/>
           <w:sz w:val="22"/>
           <w:szCs w:val="22"/>
         </w:rPr>
@@ -1403,7 +1403,7 @@
       </w:r>
       <w:r>
         <w:rPr>
-          <w:rFonts w:ascii="Arial" w:hAnsi="Arial" w:cs="Arial"/>
+          <w:rFonts w:ascii="Arial" w:hAnsi="Arial" w:eastAsia="Arial" w:cs="Arial"/>
           <w:sz w:val="22"/>
           <w:szCs w:val="22"/>
         </w:rPr>
@@ -1411,7 +1411,7 @@
       </w:r>
       <w:r>
         <w:rPr>
-          <w:rFonts w:ascii="Arial" w:hAnsi="Arial" w:cs="Arial"/>
+          <w:rFonts w:ascii="Arial" w:hAnsi="Arial" w:eastAsia="Arial" w:cs="Arial"/>
           <w:sz w:val="22"/>
           <w:szCs w:val="22"/>
         </w:rPr>
@@ -1419,7 +1419,7 @@
       </w:r>
       <w:r>
         <w:rPr>
-          <w:rFonts w:ascii="Arial" w:hAnsi="Arial" w:cs="Arial"/>
+          <w:rFonts w:ascii="Arial" w:hAnsi="Arial" w:eastAsia="Arial" w:cs="Arial"/>
           <w:sz w:val="22"/>
           <w:szCs w:val="22"/>
         </w:rPr>
@@ -1427,7 +1427,7 @@
       </w:r>
       <w:r>
         <w:rPr>
-          <w:rFonts w:ascii="Arial" w:hAnsi="Arial" w:cs="Arial"/>
+          <w:rFonts w:ascii="Arial" w:hAnsi="Arial" w:eastAsia="Arial" w:cs="Arial"/>
           <w:sz w:val="22"/>
           <w:szCs w:val="22"/>
         </w:rPr>
@@ -1485,7 +1485,7 @@
                   <w:pPr>
                     <w:jc w:val="center"/>
                     <w:rPr>
-                      <w:rFonts w:ascii="Arial" w:hAnsi="Arial" w:cs="Arial"/>
+                      <w:rFonts w:ascii="Arial" w:hAnsi="Arial" w:eastAsia="Arial" w:cs="Arial"/>
                       <w:b/>
                       <w:sz w:val="22"/>
                       <w:szCs w:val="22"/>
@@ -1493,18 +1493,18 @@
                   </w:pPr>
                   <w:r>
                     <w:rPr>
-                      <w:rFonts w:ascii="Arial" w:hAnsi="Arial" w:cs="Arial"/>
+                      <w:rFonts w:ascii="Arial" w:hAnsi="Arial" w:eastAsia="Arial" w:cs="Arial"/>
                       <w:b/>
                       <w:sz w:val="22"/>
                       <w:szCs w:val="22"/>
                     </w:rPr>
-                    <w:t>{firmante}</w:t>
+                    <w:t>ELIANA ROJAS SILVA</w:t>
                   </w:r>
                 </w:p>
                 <w:p>
                   <w:pPr>
                     <w:rPr>
-                      <w:rFonts w:ascii="Arial" w:hAnsi="Arial" w:cs="Arial"/>
+                      <w:rFonts w:ascii="Arial" w:hAnsi="Arial" w:eastAsia="Arial" w:cs="Arial"/>
                       <w:b/>
                       <w:sz w:val="22"/>
                       <w:szCs w:val="22"/>
@@ -1512,12 +1512,12 @@
                   </w:pPr>
                   <w:r>
                     <w:rPr>
-                      <w:rFonts w:ascii="Arial" w:hAnsi="Arial" w:cs="Arial"/>
+                      <w:rFonts w:ascii="Arial" w:hAnsi="Arial" w:eastAsia="Arial" w:cs="Arial"/>
                       <w:b/>
                       <w:sz w:val="22"/>
                       <w:szCs w:val="22"/>
                     </w:rPr>
-                    <w:t xml:space="preserve">          {cargo_firmante}</w:t>
+                    <w:t xml:space="preserve">          ENCARGADA SECCIÓN GESTIÓN DE INGRESOS</w:t>
                   </w:r>
                 </w:p>
                 <w:p>

</xml_diff>

<commit_message>
Formato del memo: MOTIVO y párrafo "Se solicita" alineados y justificados
- MOTIVO: un párrafo justificado por documento ("NBCH 453127: ..."), alineado
  con el texto de DE/PARA/ASUNTO
- "Se solicita aplicación...": sangría de primera línea y justificado
- El bloque DISTRIBUCIÓN no se divide entre páginas

Co-Authored-By: Claude Opus 5.5 <noreply@anthropic.com>
</commit_message>
<xml_diff>
--- a/templates/memo_template.docx
+++ b/templates/memo_template.docx
@@ -699,21 +699,45 @@
           <w:tab w:val="left" w:pos="1985"/>
         </w:tabs>
         <w:ind w:left="2127" w:hanging="2127"/>
-        <w:jc w:val="left"/>
-        <w:rPr>
-          <w:rFonts w:ascii="Arial" w:hAnsi="Arial" w:eastAsia="Arial" w:cs="Arial"/>
-          <w:sz w:val="22"/>
-          <w:szCs w:val="22"/>
-        </w:rPr>
-      </w:pPr>
-      <w:r>
-        <w:rPr>
-          <w:rFonts w:ascii="Arial" w:hAnsi="Arial" w:eastAsia="Arial" w:cs="Arial"/>
-          <w:bCs/>
-          <w:sz w:val="22"/>
-          <w:szCs w:val="22"/>
-        </w:rPr>
-        <w:t>MOTIVO</w:t>
+        <w:jc w:val="both"/>
+        <w:rPr>
+          <w:rFonts w:ascii="Arial" w:hAnsi="Arial" w:eastAsia="Arial" w:cs="Arial"/>
+          <w:sz w:val="22"/>
+          <w:szCs w:val="22"/>
+        </w:rPr>
+      </w:pPr>
+      <w:r>
+        <w:rPr>
+          <w:rFonts w:ascii="Arial" w:hAnsi="Arial" w:eastAsia="Arial" w:cs="Arial"/>
+          <w:bCs/>
+          <w:sz w:val="22"/>
+          <w:szCs w:val="22"/>
+        </w:rPr>
+        <w:t xml:space="preserve">{#motivos}</w:t>
+      </w:r>
+    </w:p>
+    <w:p>
+      <w:pPr>
+        <w:tabs>
+          <w:tab w:val="left" w:pos="1843"/>
+          <w:tab w:val="left" w:pos="1985"/>
+        </w:tabs>
+        <w:ind w:left="2127" w:hanging="2127"/>
+        <w:jc w:val="both"/>
+        <w:rPr>
+          <w:rFonts w:ascii="Arial" w:hAnsi="Arial" w:eastAsia="Arial" w:cs="Arial"/>
+          <w:sz w:val="22"/>
+          <w:szCs w:val="22"/>
+        </w:rPr>
+      </w:pPr>
+      <w:r>
+        <w:rPr>
+          <w:rFonts w:ascii="Arial" w:hAnsi="Arial" w:eastAsia="Arial" w:cs="Arial"/>
+          <w:bCs/>
+          <w:sz w:val="22"/>
+          <w:szCs w:val="22"/>
+        </w:rPr>
+        <w:t xml:space="preserve">{#primero}MOTIVO{/primero}</w:t>
       </w:r>
       <w:r>
         <w:rPr>
@@ -723,7 +747,7 @@
           <w:szCs w:val="22"/>
         </w:rPr>
         <w:tab/>
-        <w:t>:</w:t>
+        <w:t xml:space="preserve">{#primero}:{/primero}</w:t>
       </w:r>
       <w:r>
         <w:rPr>
@@ -737,7 +761,6 @@
       <w:r>
         <w:rPr>
           <w:rFonts w:ascii="Arial" w:hAnsi="Arial" w:eastAsia="Arial" w:cs="Arial"/>
-          <w:b/>
           <w:bCs/>
           <w:sz w:val="22"/>
           <w:szCs w:val="22"/>
@@ -752,35 +775,39 @@
           <w:sz w:val="22"/>
           <w:szCs w:val="22"/>
         </w:rPr>
-        <w:t xml:space="preserve">{#motivos}{#br}</w:t>
-      </w:r>
-      <w:r>
-        <w:rPr>
-          <w:rFonts w:ascii="Arial" w:hAnsi="Arial" w:eastAsia="Arial" w:cs="Arial"/>
-          <w:b/>
-          <w:bCs/>
-          <w:sz w:val="22"/>
-          <w:szCs w:val="22"/>
-        </w:rPr>
-        <w:br/>
-      </w:r>
-      <w:r>
-        <w:rPr>
-          <w:rFonts w:ascii="Arial" w:hAnsi="Arial" w:eastAsia="Arial" w:cs="Arial"/>
-          <w:b/>
-          <w:bCs/>
-          <w:sz w:val="22"/>
-          <w:szCs w:val="22"/>
-        </w:rPr>
-        <w:t xml:space="preserve">{/br}{doc} {nro} </w:t>
-      </w:r>
-      <w:r>
-        <w:rPr>
-          <w:rFonts w:ascii="Arial" w:hAnsi="Arial" w:eastAsia="Arial" w:cs="Arial"/>
-          <w:sz w:val="22"/>
-          <w:szCs w:val="22"/>
-        </w:rPr>
-        <w:t xml:space="preserve">{justificacion}{/motivos}</w:t>
+        <w:t xml:space="preserve">{doc} {nro}:</w:t>
+      </w:r>
+      <w:r>
+        <w:rPr>
+          <w:rFonts w:ascii="Arial" w:hAnsi="Arial" w:eastAsia="Arial" w:cs="Arial"/>
+          <w:sz w:val="22"/>
+          <w:szCs w:val="22"/>
+        </w:rPr>
+        <w:t xml:space="preserve"> {justificacion}</w:t>
+      </w:r>
+    </w:p>
+    <w:p>
+      <w:pPr>
+        <w:tabs>
+          <w:tab w:val="left" w:pos="1843"/>
+          <w:tab w:val="left" w:pos="1985"/>
+        </w:tabs>
+        <w:ind w:left="2127" w:hanging="2127"/>
+        <w:jc w:val="both"/>
+        <w:rPr>
+          <w:rFonts w:ascii="Arial" w:hAnsi="Arial" w:eastAsia="Arial" w:cs="Arial"/>
+          <w:sz w:val="22"/>
+          <w:szCs w:val="22"/>
+        </w:rPr>
+      </w:pPr>
+      <w:r>
+        <w:rPr>
+          <w:rFonts w:ascii="Arial" w:hAnsi="Arial" w:eastAsia="Arial" w:cs="Arial"/>
+          <w:bCs/>
+          <w:sz w:val="22"/>
+          <w:szCs w:val="22"/>
+        </w:rPr>
+        <w:t xml:space="preserve">{/motivos}</w:t>
       </w:r>
     </w:p>
     <w:p>
@@ -815,6 +842,7 @@
     </w:p>
     <w:p>
       <w:pPr>
+        <w:ind w:firstLine="2127"/>
         <w:jc w:val="both"/>
         <w:rPr>
           <w:rFonts w:ascii="Arial" w:hAnsi="Arial" w:eastAsia="Arial" w:cs="Arial"/>
@@ -1660,6 +1688,7 @@
     </w:p>
     <w:p>
       <w:pPr>
+        <w:keepNext/>
         <w:rPr>
           <w:rFonts w:ascii="Arial" w:hAnsi="Arial" w:cs="Arial"/>
           <w:b/>
@@ -1683,6 +1712,7 @@
     </w:p>
     <w:p>
       <w:pPr>
+        <w:keepNext/>
         <w:rPr>
           <w:rFonts w:ascii="Arial" w:hAnsi="Arial" w:cs="Arial"/>
           <w:b/>
@@ -1804,6 +1834,7 @@
     </w:p>
     <w:p>
       <w:pPr>
+        <w:keepNext/>
         <w:rPr>
           <w:rFonts w:ascii="Arial" w:hAnsi="Arial" w:cs="Arial"/>
           <w:b/>
@@ -1895,6 +1926,7 @@
     </w:p>
     <w:p>
       <w:pPr>
+        <w:keepNext/>
         <w:rPr>
           <w:rFonts w:ascii="Arial" w:hAnsi="Arial" w:cs="Arial"/>
           <w:bCs/>

</xml_diff>